<commit_message>
updated Attack Surface Analysis Report (rewrote report section to align with ASA tertiary documents)
</commit_message>
<xml_diff>
--- a/source/reference_documents/secondary_documents/design phase/Attack Surface Analysis Report/Attack Surface Analysis Report.docx
+++ b/source/reference_documents/secondary_documents/design phase/Attack Surface Analysis Report/Attack Surface Analysis Report.docx
@@ -1,6 +1,6 @@
 
 <file path=word/document.xml><?xml version="1.0" encoding="utf-8"?>
-<w:document xmlns:wpc="http://schemas.microsoft.com/office/word/2010/wordprocessingCanvas" xmlns:cx="http://schemas.microsoft.com/office/drawing/2014/chartex" xmlns:cx1="http://schemas.microsoft.com/office/drawing/2015/9/8/chartex" xmlns:cx2="http://schemas.microsoft.com/office/drawing/2015/10/21/chartex" xmlns:cx3="http://schemas.microsoft.com/office/drawing/2016/5/9/chartex" xmlns:cx4="http://schemas.microsoft.com/office/drawing/2016/5/10/chartex" xmlns:cx5="http://schemas.microsoft.com/office/drawing/2016/5/11/chartex" xmlns:cx6="http://schemas.microsoft.com/office/drawing/2016/5/12/chartex" xmlns:cx7="http://schemas.microsoft.com/office/drawing/2016/5/13/chartex" xmlns:cx8="http://schemas.microsoft.com/office/drawing/2016/5/14/chartex" xmlns:mc="http://schemas.openxmlformats.org/markup-compatibility/2006" xmlns:aink="http://schemas.microsoft.com/office/drawing/2016/ink" xmlns:am3d="http://schemas.microsoft.com/office/drawing/2017/model3d" xmlns:o="urn:schemas-microsoft-com:office:office" xmlns:oel="http://schemas.microsoft.com/office/2019/extlst" xmlns:r="http://schemas.openxmlformats.org/officeDocument/2006/relationships" xmlns:m="http://schemas.openxmlformats.org/officeDocument/2006/math" xmlns:v="urn:schemas-microsoft-com:vml" xmlns:wp14="http://schemas.microsoft.com/office/word/2010/wordprocessingDrawing" xmlns:wp="http://schemas.openxmlformats.org/drawingml/2006/wordprocessingDrawing" xmlns:w10="urn:schemas-microsoft-com:office:word" xmlns:w="http://schemas.openxmlformats.org/wordprocessingml/2006/main" xmlns:w14="http://schemas.microsoft.com/office/word/2010/wordml" xmlns:w15="http://schemas.microsoft.com/office/word/2012/wordml" xmlns:w16cex="http://schemas.microsoft.com/office/word/2018/wordml/cex" xmlns:w16cid="http://schemas.microsoft.com/office/word/2016/wordml/cid" xmlns:w16="http://schemas.microsoft.com/office/word/2018/wordml" xmlns:w16sdtdh="http://schemas.microsoft.com/office/word/2020/wordml/sdtdatahash" xmlns:w16se="http://schemas.microsoft.com/office/word/2015/wordml/symex" xmlns:wpg="http://schemas.microsoft.com/office/word/2010/wordprocessingGroup" xmlns:wpi="http://schemas.microsoft.com/office/word/2010/wordprocessingInk" xmlns:wne="http://schemas.microsoft.com/office/word/2006/wordml" xmlns:wps="http://schemas.microsoft.com/office/word/2010/wordprocessingShape" mc:Ignorable="w14 w15 w16se w16cid w16 w16cex w16sdtdh wp14">
+<w:document xmlns:wpc="http://schemas.microsoft.com/office/word/2010/wordprocessingCanvas" xmlns:cx="http://schemas.microsoft.com/office/drawing/2014/chartex" xmlns:cx1="http://schemas.microsoft.com/office/drawing/2015/9/8/chartex" xmlns:cx2="http://schemas.microsoft.com/office/drawing/2015/10/21/chartex" xmlns:cx3="http://schemas.microsoft.com/office/drawing/2016/5/9/chartex" xmlns:cx4="http://schemas.microsoft.com/office/drawing/2016/5/10/chartex" xmlns:cx5="http://schemas.microsoft.com/office/drawing/2016/5/11/chartex" xmlns:cx6="http://schemas.microsoft.com/office/drawing/2016/5/12/chartex" xmlns:cx7="http://schemas.microsoft.com/office/drawing/2016/5/13/chartex" xmlns:cx8="http://schemas.microsoft.com/office/drawing/2016/5/14/chartex" xmlns:mc="http://schemas.openxmlformats.org/markup-compatibility/2006" xmlns:aink="http://schemas.microsoft.com/office/drawing/2016/ink" xmlns:am3d="http://schemas.microsoft.com/office/drawing/2017/model3d" xmlns:o="urn:schemas-microsoft-com:office:office" xmlns:oel="http://schemas.microsoft.com/office/2019/extlst" xmlns:r="http://schemas.openxmlformats.org/officeDocument/2006/relationships" xmlns:m="http://schemas.openxmlformats.org/officeDocument/2006/math" xmlns:v="urn:schemas-microsoft-com:vml" xmlns:wp14="http://schemas.microsoft.com/office/word/2010/wordprocessingDrawing" xmlns:wp="http://schemas.openxmlformats.org/drawingml/2006/wordprocessingDrawing" xmlns:w10="urn:schemas-microsoft-com:office:word" xmlns:w="http://schemas.openxmlformats.org/wordprocessingml/2006/main" xmlns:w14="http://schemas.microsoft.com/office/word/2010/wordml" xmlns:w15="http://schemas.microsoft.com/office/word/2012/wordml" xmlns:w16cex="http://schemas.microsoft.com/office/word/2018/wordml/cex" xmlns:w16cid="http://schemas.microsoft.com/office/word/2016/wordml/cid" xmlns:w16="http://schemas.microsoft.com/office/word/2018/wordml" xmlns:w16du="http://schemas.microsoft.com/office/word/2023/wordml/word16du" xmlns:w16sdtdh="http://schemas.microsoft.com/office/word/2020/wordml/sdtdatahash" xmlns:w16sdtfl="http://schemas.microsoft.com/office/word/2024/wordml/sdtformatlock" xmlns:w16se="http://schemas.microsoft.com/office/word/2015/wordml/symex" xmlns:wpg="http://schemas.microsoft.com/office/word/2010/wordprocessingGroup" xmlns:wpi="http://schemas.microsoft.com/office/word/2010/wordprocessingInk" xmlns:wne="http://schemas.microsoft.com/office/word/2006/wordml" xmlns:wps="http://schemas.microsoft.com/office/word/2010/wordprocessingShape" mc:Ignorable="w14 w15 w16se w16cid w16 w16cex w16sdtdh w16sdtfl w16du wp14">
   <w:body>
     <w:p>
       <w:pPr>
@@ -28,7 +28,7 @@
         <w:t xml:space="preserve">Version </w:t>
       </w:r>
       <w:r>
-        <w:t>6</w:t>
+        <w:t>7</w:t>
       </w:r>
     </w:p>
     <w:p>
@@ -45,7 +45,7 @@
         <w:rPr>
           <w:noProof/>
         </w:rPr>
-        <w:t>2/7/24 2:30 PM</w:t>
+        <w:t>3/31/26 1:53 PM</w:t>
       </w:r>
       <w:r>
         <w:fldChar w:fldCharType="end"/>
@@ -163,45 +163,7 @@
         </w:rPr>
       </w:pPr>
       <w:r>
-        <w:t xml:space="preserve">This document is motivated by the need to have the minimal necessary attack surface. This is necessary given the nature of safety-critical, cyber-physical systems, subject to certifications such as </w:t>
-      </w:r>
-      <w:r>
-        <w:rPr>
-          <w:b/>
-          <w:bCs/>
-        </w:rPr>
-        <w:t>ISO</w:t>
-      </w:r>
-      <w:r>
-        <w:rPr>
-          <w:b/>
-          <w:bCs/>
-        </w:rPr>
-        <w:t>/SAE</w:t>
-      </w:r>
-      <w:r>
-        <w:rPr>
-          <w:b/>
-          <w:bCs/>
-        </w:rPr>
-        <w:t xml:space="preserve"> 21434</w:t>
-      </w:r>
-      <w:r>
-        <w:t xml:space="preserve"> and </w:t>
-      </w:r>
-      <w:r>
-        <w:rPr>
-          <w:b/>
-          <w:bCs/>
-        </w:rPr>
-        <w:t xml:space="preserve">ISO </w:t>
-      </w:r>
-      <w:r>
-        <w:rPr>
-          <w:b/>
-          <w:bCs/>
-        </w:rPr>
-        <w:t>26262</w:t>
+        <w:t>This document is motivated by the need to have the minimal attack surface. This is necessary given the nature of safety-critical, cyber-physical systems</w:t>
       </w:r>
       <w:r>
         <w:rPr>
@@ -235,7 +197,19 @@
         <w:rPr>
           <w:lang w:val="en-US"/>
         </w:rPr>
-        <w:t xml:space="preserve">was created by </w:t>
+        <w:t xml:space="preserve">was </w:t>
+      </w:r>
+      <w:r>
+        <w:rPr>
+          <w:lang w:val="en-US"/>
+        </w:rPr>
+        <w:t xml:space="preserve">originally </w:t>
+      </w:r>
+      <w:r>
+        <w:rPr>
+          <w:lang w:val="en-US"/>
+        </w:rPr>
+        <w:t xml:space="preserve">created by </w:t>
       </w:r>
       <w:r>
         <w:rPr>
@@ -645,7 +619,6 @@
         <w:tc>
           <w:tcPr>
             <w:tcW w:w="1520" w:type="dxa"/>
-            <w:shd w:val="clear" w:color="auto" w:fill="auto"/>
             <w:tcMar>
               <w:top w:w="100" w:type="dxa"/>
               <w:left w:w="100" w:type="dxa"/>
@@ -683,7 +656,6 @@
         <w:tc>
           <w:tcPr>
             <w:tcW w:w="2610" w:type="dxa"/>
-            <w:shd w:val="clear" w:color="auto" w:fill="auto"/>
             <w:tcMar>
               <w:top w:w="100" w:type="dxa"/>
               <w:left w:w="100" w:type="dxa"/>
@@ -713,7 +685,6 @@
         <w:tc>
           <w:tcPr>
             <w:tcW w:w="1520" w:type="dxa"/>
-            <w:shd w:val="clear" w:color="auto" w:fill="auto"/>
             <w:tcMar>
               <w:top w:w="100" w:type="dxa"/>
               <w:left w:w="100" w:type="dxa"/>
@@ -751,7 +722,6 @@
         <w:tc>
           <w:tcPr>
             <w:tcW w:w="2610" w:type="dxa"/>
-            <w:shd w:val="clear" w:color="auto" w:fill="auto"/>
             <w:tcMar>
               <w:top w:w="100" w:type="dxa"/>
               <w:left w:w="100" w:type="dxa"/>
@@ -781,7 +751,6 @@
         <w:tc>
           <w:tcPr>
             <w:tcW w:w="1520" w:type="dxa"/>
-            <w:shd w:val="clear" w:color="auto" w:fill="auto"/>
             <w:tcMar>
               <w:top w:w="100" w:type="dxa"/>
               <w:left w:w="100" w:type="dxa"/>
@@ -819,7 +788,6 @@
         <w:tc>
           <w:tcPr>
             <w:tcW w:w="2610" w:type="dxa"/>
-            <w:shd w:val="clear" w:color="auto" w:fill="auto"/>
             <w:tcMar>
               <w:top w:w="100" w:type="dxa"/>
               <w:left w:w="100" w:type="dxa"/>
@@ -1004,7 +972,6 @@
         <w:tc>
           <w:tcPr>
             <w:tcW w:w="1520" w:type="dxa"/>
-            <w:shd w:val="clear" w:color="auto" w:fill="auto"/>
             <w:tcMar>
               <w:top w:w="100" w:type="dxa"/>
               <w:left w:w="100" w:type="dxa"/>
@@ -1035,7 +1002,6 @@
         <w:tc>
           <w:tcPr>
             <w:tcW w:w="2160" w:type="dxa"/>
-            <w:shd w:val="clear" w:color="auto" w:fill="auto"/>
             <w:tcMar>
               <w:top w:w="100" w:type="dxa"/>
               <w:left w:w="100" w:type="dxa"/>
@@ -1058,7 +1024,6 @@
         <w:tc>
           <w:tcPr>
             <w:tcW w:w="1520" w:type="dxa"/>
-            <w:shd w:val="clear" w:color="auto" w:fill="auto"/>
             <w:tcMar>
               <w:top w:w="100" w:type="dxa"/>
               <w:left w:w="100" w:type="dxa"/>
@@ -1089,7 +1054,6 @@
         <w:tc>
           <w:tcPr>
             <w:tcW w:w="2160" w:type="dxa"/>
-            <w:shd w:val="clear" w:color="auto" w:fill="auto"/>
             <w:tcMar>
               <w:top w:w="100" w:type="dxa"/>
               <w:left w:w="100" w:type="dxa"/>
@@ -1112,7 +1076,6 @@
         <w:tc>
           <w:tcPr>
             <w:tcW w:w="1520" w:type="dxa"/>
-            <w:shd w:val="clear" w:color="auto" w:fill="auto"/>
             <w:tcMar>
               <w:top w:w="100" w:type="dxa"/>
               <w:left w:w="100" w:type="dxa"/>
@@ -1143,7 +1106,6 @@
         <w:tc>
           <w:tcPr>
             <w:tcW w:w="2160" w:type="dxa"/>
-            <w:shd w:val="clear" w:color="auto" w:fill="auto"/>
             <w:tcMar>
               <w:top w:w="100" w:type="dxa"/>
               <w:left w:w="100" w:type="dxa"/>
@@ -1241,20 +1203,23 @@
     </w:p>
     <w:p>
       <w:pPr>
+        <w:rPr>
+          <w:sz w:val="32"/>
+          <w:szCs w:val="32"/>
+        </w:rPr>
+      </w:pPr>
+      <w:bookmarkStart w:id="8" w:name="_sel80lfrfmfd" w:colFirst="0" w:colLast="0"/>
+      <w:bookmarkStart w:id="9" w:name="_ukgjr2k3aiz2" w:colFirst="0" w:colLast="0"/>
+      <w:bookmarkEnd w:id="8"/>
+      <w:bookmarkEnd w:id="9"/>
+      <w:r>
+        <w:br w:type="page"/>
+      </w:r>
+    </w:p>
+    <w:p>
+      <w:pPr>
         <w:pStyle w:val="Heading2"/>
       </w:pPr>
-      <w:bookmarkStart w:id="8" w:name="_sel80lfrfmfd" w:colFirst="0" w:colLast="0"/>
-      <w:bookmarkEnd w:id="8"/>
-      <w:r>
-        <w:br w:type="page"/>
-      </w:r>
-    </w:p>
-    <w:p>
-      <w:pPr>
-        <w:pStyle w:val="Heading2"/>
-      </w:pPr>
-      <w:bookmarkStart w:id="9" w:name="_ukgjr2k3aiz2" w:colFirst="0" w:colLast="0"/>
-      <w:bookmarkEnd w:id="9"/>
       <w:r>
         <w:lastRenderedPageBreak/>
         <w:t>Triage</w:t>
@@ -1282,7 +1247,6 @@
         <w:tc>
           <w:tcPr>
             <w:tcW w:w="1520" w:type="dxa"/>
-            <w:shd w:val="clear" w:color="auto" w:fill="auto"/>
             <w:tcMar>
               <w:top w:w="100" w:type="dxa"/>
               <w:left w:w="100" w:type="dxa"/>
@@ -1313,7 +1277,6 @@
         <w:tc>
           <w:tcPr>
             <w:tcW w:w="3330" w:type="dxa"/>
-            <w:shd w:val="clear" w:color="auto" w:fill="auto"/>
             <w:tcMar>
               <w:top w:w="100" w:type="dxa"/>
               <w:left w:w="100" w:type="dxa"/>
@@ -1336,7 +1299,6 @@
         <w:tc>
           <w:tcPr>
             <w:tcW w:w="1520" w:type="dxa"/>
-            <w:shd w:val="clear" w:color="auto" w:fill="auto"/>
             <w:tcMar>
               <w:top w:w="100" w:type="dxa"/>
               <w:left w:w="100" w:type="dxa"/>
@@ -1367,7 +1329,6 @@
         <w:tc>
           <w:tcPr>
             <w:tcW w:w="3330" w:type="dxa"/>
-            <w:shd w:val="clear" w:color="auto" w:fill="auto"/>
             <w:tcMar>
               <w:top w:w="100" w:type="dxa"/>
               <w:left w:w="100" w:type="dxa"/>
@@ -1402,7 +1363,6 @@
         <w:tc>
           <w:tcPr>
             <w:tcW w:w="1520" w:type="dxa"/>
-            <w:shd w:val="clear" w:color="auto" w:fill="auto"/>
             <w:tcMar>
               <w:top w:w="100" w:type="dxa"/>
               <w:left w:w="100" w:type="dxa"/>
@@ -1433,7 +1393,6 @@
         <w:tc>
           <w:tcPr>
             <w:tcW w:w="3330" w:type="dxa"/>
-            <w:shd w:val="clear" w:color="auto" w:fill="auto"/>
             <w:tcMar>
               <w:top w:w="100" w:type="dxa"/>
               <w:left w:w="100" w:type="dxa"/>
@@ -1642,61 +1601,112 @@
     </w:p>
     <w:p>
       <w:pPr>
-        <w:pStyle w:val="Heading2"/>
+        <w:pStyle w:val="Heading3"/>
       </w:pPr>
       <w:r>
         <w:lastRenderedPageBreak/>
-        <w:t>Report Content</w:t>
-      </w:r>
-    </w:p>
-    <w:p>
-      <w:pPr>
-        <w:pStyle w:val="Heading3"/>
-      </w:pPr>
-      <w:r>
-        <w:t>Attack Surface Analysis Report</w:t>
-      </w:r>
-    </w:p>
-    <w:p>
-      <w:pPr>
-        <w:spacing w:after="240"/>
-        <w:jc w:val="both"/>
-      </w:pPr>
-      <w:r>
-        <w:t>The attack surface analysis report should detail the areas of excessive exposure. These should be organized by type and provide sufficient information to enable a developer to reduce the exposure level.</w:t>
-      </w:r>
-      <w:r>
-        <w:t xml:space="preserve"> These will form a 3-tuple (</w:t>
+        <w:t>Triaged Threat Candidates</w:t>
+      </w:r>
+    </w:p>
+    <w:p>
+      <w:pPr>
+        <w:jc w:val="both"/>
+      </w:pPr>
+      <w:r>
+        <w:rPr>
+          <w:rFonts w:hint="eastAsia"/>
+          <w:lang w:val="en-US"/>
+        </w:rPr>
+        <w:t xml:space="preserve">The recommended form of the </w:t>
       </w:r>
       <w:r>
         <w:rPr>
           <w:b/>
           <w:bCs/>
         </w:rPr>
-        <w:t>type</w:t>
-      </w:r>
-      <w:r>
-        <w:t xml:space="preserve">, </w:t>
+        <w:t>triaged threat candidates</w:t>
+      </w:r>
+      <w:r>
+        <w:t xml:space="preserve"> </w:t>
+      </w:r>
+      <w:r>
+        <w:rPr>
+          <w:rFonts w:hint="eastAsia"/>
+          <w:lang w:val="en-US"/>
+        </w:rPr>
+        <w:t>artifact is a Static Analysis Results Interchange Format (</w:t>
       </w:r>
       <w:r>
         <w:rPr>
           <w:b/>
           <w:bCs/>
-        </w:rPr>
-        <w:t>reason</w:t>
-      </w:r>
-      <w:r>
-        <w:t xml:space="preserve">, </w:t>
+          <w:lang w:val="en-US"/>
+        </w:rPr>
+        <w:t>SARIF</w:t>
+      </w:r>
+      <w:r>
+        <w:rPr>
+          <w:rFonts w:hint="eastAsia"/>
+          <w:lang w:val="en-US"/>
+        </w:rPr>
+        <w:t xml:space="preserve">) encoded JSON. This document assumes SARIF version 2.1.0 </w:t>
       </w:r>
       <w:r>
         <w:rPr>
           <w:b/>
           <w:bCs/>
-        </w:rPr>
-        <w:t>mitigation</w:t>
-      </w:r>
-      <w:r>
-        <w:t>)</w:t>
+          <w:color w:val="0070C0"/>
+          <w:vertAlign w:val="superscript"/>
+          <w:lang w:val="en-US"/>
+        </w:rPr>
+        <w:t>[</w:t>
+      </w:r>
+      <w:r>
+        <w:rPr>
+          <w:b/>
+          <w:bCs/>
+          <w:color w:val="0070C0"/>
+          <w:vertAlign w:val="superscript"/>
+          <w:lang w:val="en-US"/>
+        </w:rPr>
+        <w:t>4</w:t>
+      </w:r>
+      <w:r>
+        <w:rPr>
+          <w:b/>
+          <w:bCs/>
+          <w:color w:val="0070C0"/>
+          <w:vertAlign w:val="superscript"/>
+          <w:lang w:val="en-US"/>
+        </w:rPr>
+        <w:t>]</w:t>
+      </w:r>
+      <w:r>
+        <w:rPr>
+          <w:b/>
+          <w:bCs/>
+          <w:color w:val="0070C0"/>
+          <w:lang w:val="en-US"/>
+        </w:rPr>
+        <w:t xml:space="preserve"> </w:t>
+      </w:r>
+      <w:r>
+        <w:rPr>
+          <w:rFonts w:hint="eastAsia"/>
+          <w:lang w:val="en-US"/>
+        </w:rPr>
+        <w:t>or later</w:t>
+      </w:r>
+      <w:r>
+        <w:t>.</w:t>
+      </w:r>
+    </w:p>
+    <w:p>
+      <w:pPr>
+        <w:pStyle w:val="Heading3"/>
+      </w:pPr>
+      <w:r>
+        <w:t>Attack Surface Analysis Report</w:t>
       </w:r>
     </w:p>
     <w:p>
@@ -1705,7 +1715,22 @@
         <w:jc w:val="both"/>
       </w:pPr>
       <w:r>
-        <w:t>Types of excessive exposure include:</w:t>
+        <w:t>The attack surface analysis report should detail the areas of excessive exposure. These should be organized by type and provide sufficient information to enable a developer to reduce the exposure level.</w:t>
+      </w:r>
+    </w:p>
+    <w:p>
+      <w:pPr>
+        <w:spacing w:after="240"/>
+        <w:jc w:val="both"/>
+      </w:pPr>
+      <w:r>
+        <w:t>The report should be organized into summary and details sections. The summary</w:t>
+      </w:r>
+      <w:r>
+        <w:t xml:space="preserve"> i</w:t>
+      </w:r>
+      <w:r>
+        <w:t>ncludes:</w:t>
       </w:r>
     </w:p>
     <w:p>
@@ -1720,10 +1745,10 @@
         <w:jc w:val="both"/>
       </w:pPr>
       <w:r>
-        <w:t>Ports</w:t>
-      </w:r>
-      <w:r>
-        <w:t xml:space="preserve"> (physical and logical)</w:t>
+        <w:t xml:space="preserve">Description of the </w:t>
+      </w:r>
+      <w:r>
+        <w:t>element</w:t>
       </w:r>
     </w:p>
     <w:p>
@@ -1738,7 +1763,7 @@
         <w:jc w:val="both"/>
       </w:pPr>
       <w:r>
-        <w:t>Protocols</w:t>
+        <w:t>Abstraction (physical, logical, process)</w:t>
       </w:r>
     </w:p>
     <w:p>
@@ -1753,7 +1778,42 @@
         <w:jc w:val="both"/>
       </w:pPr>
       <w:r>
-        <w:t>System services</w:t>
+        <w:t xml:space="preserve">Image of the </w:t>
+      </w:r>
+      <w:r>
+        <w:t>element</w:t>
+      </w:r>
+      <w:r>
+        <w:t xml:space="preserve"> (</w:t>
+      </w:r>
+      <w:r>
+        <w:t xml:space="preserve">photograph, </w:t>
+      </w:r>
+      <w:r>
+        <w:t>diagram</w:t>
+      </w:r>
+      <w:r>
+        <w:t>)</w:t>
+      </w:r>
+    </w:p>
+    <w:p>
+      <w:pPr>
+        <w:spacing w:after="240"/>
+      </w:pPr>
+      <w:r>
+        <w:t xml:space="preserve">Individual </w:t>
+      </w:r>
+      <w:r>
+        <w:t>entities</w:t>
+      </w:r>
+      <w:r>
+        <w:t xml:space="preserve"> </w:t>
+      </w:r>
+      <w:r>
+        <w:t>should include</w:t>
+      </w:r>
+      <w:r>
+        <w:t>:</w:t>
       </w:r>
     </w:p>
     <w:p>
@@ -1768,7 +1828,10 @@
         <w:jc w:val="both"/>
       </w:pPr>
       <w:r>
-        <w:t>Data structures</w:t>
+        <w:t>entity</w:t>
+      </w:r>
+      <w:r>
+        <w:t xml:space="preserve"> ID (unique)</w:t>
       </w:r>
     </w:p>
     <w:p>
@@ -1783,7 +1846,7 @@
         <w:jc w:val="both"/>
       </w:pPr>
       <w:r>
-        <w:t>User accounts</w:t>
+        <w:t>entity name</w:t>
       </w:r>
     </w:p>
     <w:p>
@@ -1798,7 +1861,7 @@
         <w:jc w:val="both"/>
       </w:pPr>
       <w:r>
-        <w:t>Diagnostics</w:t>
+        <w:t>Description of the entity</w:t>
       </w:r>
     </w:p>
     <w:p>
@@ -1813,7 +1876,7 @@
         <w:jc w:val="both"/>
       </w:pPr>
       <w:r>
-        <w:t>Remote execution</w:t>
+        <w:t>Purpose of the entity</w:t>
       </w:r>
     </w:p>
     <w:p>
@@ -1828,7 +1891,7 @@
         <w:jc w:val="both"/>
       </w:pPr>
       <w:r>
-        <w:t>Data connection lifetime</w:t>
+        <w:t>Requirement ID</w:t>
       </w:r>
     </w:p>
     <w:p>
@@ -1843,7 +1906,60 @@
         <w:jc w:val="both"/>
       </w:pPr>
       <w:r>
-        <w:t>Features</w:t>
+        <w:t>Abstraction-specific information</w:t>
+      </w:r>
+    </w:p>
+    <w:p>
+      <w:pPr>
+        <w:pStyle w:val="ListParagraph"/>
+        <w:numPr>
+          <w:ilvl w:val="1"/>
+          <w:numId w:val="5"/>
+        </w:numPr>
+        <w:spacing w:after="240"/>
+        <w:ind w:left="630"/>
+        <w:jc w:val="both"/>
+      </w:pPr>
+      <w:r>
+        <w:t>Physical (interface)</w:t>
+      </w:r>
+    </w:p>
+    <w:p>
+      <w:pPr>
+        <w:pStyle w:val="ListParagraph"/>
+        <w:numPr>
+          <w:ilvl w:val="1"/>
+          <w:numId w:val="5"/>
+        </w:numPr>
+        <w:spacing w:after="240"/>
+        <w:ind w:left="630"/>
+        <w:jc w:val="both"/>
+      </w:pPr>
+      <w:r>
+        <w:t>Logical (port number, protocol)</w:t>
+      </w:r>
+    </w:p>
+    <w:p>
+      <w:pPr>
+        <w:pStyle w:val="ListParagraph"/>
+        <w:numPr>
+          <w:ilvl w:val="1"/>
+          <w:numId w:val="5"/>
+        </w:numPr>
+        <w:spacing w:after="240"/>
+        <w:ind w:left="630"/>
+        <w:jc w:val="both"/>
+      </w:pPr>
+      <w:r>
+        <w:t>Process (process type, process class)</w:t>
+      </w:r>
+    </w:p>
+    <w:p>
+      <w:pPr>
+        <w:spacing w:after="240"/>
+      </w:pPr>
+      <w:r>
+        <w:t>Individual threat candidates include:</w:t>
       </w:r>
     </w:p>
     <w:p>
@@ -1858,22 +1974,7 @@
         <w:jc w:val="both"/>
       </w:pPr>
       <w:r>
-        <w:t>Memory (general resource) pressure susceptibility</w:t>
-      </w:r>
-    </w:p>
-    <w:p>
-      <w:pPr>
-        <w:spacing w:after="240"/>
-        <w:jc w:val="both"/>
-      </w:pPr>
-      <w:r>
-        <w:t xml:space="preserve">Reasons for </w:t>
-      </w:r>
-      <w:r>
-        <w:t>reduction</w:t>
-      </w:r>
-      <w:r>
-        <w:t xml:space="preserve"> include:</w:t>
+        <w:t>Threat ID (unique)</w:t>
       </w:r>
     </w:p>
     <w:p>
@@ -1881,17 +1982,14 @@
         <w:pStyle w:val="ListParagraph"/>
         <w:numPr>
           <w:ilvl w:val="0"/>
-          <w:numId w:val="6"/>
+          <w:numId w:val="5"/>
         </w:numPr>
         <w:spacing w:after="240"/>
         <w:ind w:left="270" w:hanging="270"/>
         <w:jc w:val="both"/>
       </w:pPr>
       <w:r>
-        <w:t>U</w:t>
-      </w:r>
-      <w:r>
-        <w:t>nused</w:t>
+        <w:t>Issue type (data connection lifetime, data structures, diagnostics, features, memory pressure, ports, protocols, remote execution, system services, user accounts)</w:t>
       </w:r>
     </w:p>
     <w:p>
@@ -1899,14 +1997,14 @@
         <w:pStyle w:val="ListParagraph"/>
         <w:numPr>
           <w:ilvl w:val="0"/>
-          <w:numId w:val="6"/>
+          <w:numId w:val="5"/>
         </w:numPr>
         <w:spacing w:after="240"/>
         <w:ind w:left="270" w:hanging="270"/>
         <w:jc w:val="both"/>
       </w:pPr>
       <w:r>
-        <w:t>Debug-only (non-production)</w:t>
+        <w:t>Issue reason (debug-only, out-of-specification, unused)</w:t>
       </w:r>
     </w:p>
     <w:p>
@@ -1914,49 +2012,29 @@
         <w:pStyle w:val="ListParagraph"/>
         <w:numPr>
           <w:ilvl w:val="0"/>
-          <w:numId w:val="6"/>
+          <w:numId w:val="5"/>
         </w:numPr>
         <w:spacing w:after="240"/>
         <w:ind w:left="270" w:hanging="270"/>
         <w:jc w:val="both"/>
       </w:pPr>
       <w:r>
-        <w:t>Out-of-specification (unchecked protocol parameters, extra commands, …)</w:t>
-      </w:r>
-    </w:p>
-    <w:p>
-      <w:pPr>
+        <w:t>Detailed description of the threat</w:t>
+      </w:r>
+    </w:p>
+    <w:p>
+      <w:pPr>
+        <w:pStyle w:val="ListParagraph"/>
+        <w:numPr>
+          <w:ilvl w:val="0"/>
+          <w:numId w:val="5"/>
+        </w:numPr>
         <w:spacing w:after="240"/>
-        <w:jc w:val="both"/>
-      </w:pPr>
-      <w:r>
-        <w:t>The recommended mitigation should be actionable and verifiable.</w:t>
-      </w:r>
-    </w:p>
-    <w:p>
-      <w:pPr>
-        <w:pStyle w:val="Heading3"/>
-      </w:pPr>
-      <w:r>
-        <w:t>Triaged Threat Candidates</w:t>
-      </w:r>
-    </w:p>
-    <w:p>
-      <w:pPr>
-        <w:jc w:val="both"/>
-      </w:pPr>
-      <w:r>
-        <w:t xml:space="preserve">The triaged threat candidates have the same structure as those derived from threat modeling. Refer to the </w:t>
-      </w:r>
-      <w:r>
-        <w:rPr>
-          <w:b/>
-          <w:bCs/>
-        </w:rPr>
-        <w:t>Threat Modeling Report</w:t>
-      </w:r>
-      <w:r>
-        <w:t xml:space="preserve"> secondary document for additional information.</w:t>
+        <w:ind w:left="270" w:hanging="270"/>
+        <w:jc w:val="both"/>
+      </w:pPr>
+      <w:r>
+        <w:t>Triage determination</w:t>
       </w:r>
     </w:p>
     <w:p>
@@ -1966,6 +2044,9 @@
           <w:szCs w:val="40"/>
         </w:rPr>
       </w:pPr>
+      <w:r>
+        <w:t>It is recommended that the report be generated from a portable data representation so that it can be programmatically manipulated.</w:t>
+      </w:r>
       <w:r>
         <w:br w:type="page"/>
       </w:r>
@@ -2069,11 +2150,45 @@
         <w:t>(AVCDL secondary document)</w:t>
       </w:r>
     </w:p>
-    <w:p/>
+    <w:p>
+      <w:pPr>
+        <w:pStyle w:val="ListParagraph"/>
+        <w:numPr>
+          <w:ilvl w:val="0"/>
+          <w:numId w:val="3"/>
+        </w:numPr>
+        <w:ind w:left="360"/>
+        <w:rPr>
+          <w:color w:val="000000" w:themeColor="text1"/>
+        </w:rPr>
+      </w:pPr>
+      <w:r>
+        <w:rPr>
+          <w:b/>
+        </w:rPr>
+        <w:t>Static Analysis Results Interchange Format (SARIF) Version 2.1.0</w:t>
+      </w:r>
+      <w:r>
+        <w:rPr>
+          <w:b/>
+        </w:rPr>
+        <w:br/>
+      </w:r>
+      <w:hyperlink r:id="rId13" w:history="1">
+        <w:r>
+          <w:rPr>
+            <w:rStyle w:val="Hyperlink"/>
+            <w:bCs/>
+            <w:lang w:val="en-US"/>
+          </w:rPr>
+          <w:t>https://docs.oasis-open.org/sarif/sarif/v2.1.0/os/sarif-v2.1.0-os.pdf</w:t>
+        </w:r>
+      </w:hyperlink>
+    </w:p>
     <w:sectPr>
-      <w:footerReference w:type="even" r:id="rId13"/>
-      <w:footerReference w:type="default" r:id="rId14"/>
-      <w:headerReference w:type="first" r:id="rId15"/>
+      <w:footerReference w:type="even" r:id="rId14"/>
+      <w:footerReference w:type="default" r:id="rId15"/>
+      <w:headerReference w:type="first" r:id="rId16"/>
       <w:pgSz w:w="12240" w:h="15840"/>
       <w:pgMar w:top="1440" w:right="1440" w:bottom="1440" w:left="1440" w:header="720" w:footer="720" w:gutter="0"/>
       <w:pgNumType w:start="1"/>
@@ -2085,7 +2200,7 @@
 </file>
 
 <file path=word/endnotes.xml><?xml version="1.0" encoding="utf-8"?>
-<w:endnotes xmlns:wpc="http://schemas.microsoft.com/office/word/2010/wordprocessingCanvas" xmlns:cx="http://schemas.microsoft.com/office/drawing/2014/chartex" xmlns:cx1="http://schemas.microsoft.com/office/drawing/2015/9/8/chartex" xmlns:cx2="http://schemas.microsoft.com/office/drawing/2015/10/21/chartex" xmlns:cx3="http://schemas.microsoft.com/office/drawing/2016/5/9/chartex" xmlns:cx4="http://schemas.microsoft.com/office/drawing/2016/5/10/chartex" xmlns:cx5="http://schemas.microsoft.com/office/drawing/2016/5/11/chartex" xmlns:cx6="http://schemas.microsoft.com/office/drawing/2016/5/12/chartex" xmlns:cx7="http://schemas.microsoft.com/office/drawing/2016/5/13/chartex" xmlns:cx8="http://schemas.microsoft.com/office/drawing/2016/5/14/chartex" xmlns:mc="http://schemas.openxmlformats.org/markup-compatibility/2006" xmlns:aink="http://schemas.microsoft.com/office/drawing/2016/ink" xmlns:am3d="http://schemas.microsoft.com/office/drawing/2017/model3d" xmlns:o="urn:schemas-microsoft-com:office:office" xmlns:oel="http://schemas.microsoft.com/office/2019/extlst" xmlns:r="http://schemas.openxmlformats.org/officeDocument/2006/relationships" xmlns:m="http://schemas.openxmlformats.org/officeDocument/2006/math" xmlns:v="urn:schemas-microsoft-com:vml" xmlns:wp14="http://schemas.microsoft.com/office/word/2010/wordprocessingDrawing" xmlns:wp="http://schemas.openxmlformats.org/drawingml/2006/wordprocessingDrawing" xmlns:w10="urn:schemas-microsoft-com:office:word" xmlns:w="http://schemas.openxmlformats.org/wordprocessingml/2006/main" xmlns:w14="http://schemas.microsoft.com/office/word/2010/wordml" xmlns:w15="http://schemas.microsoft.com/office/word/2012/wordml" xmlns:w16cex="http://schemas.microsoft.com/office/word/2018/wordml/cex" xmlns:w16cid="http://schemas.microsoft.com/office/word/2016/wordml/cid" xmlns:w16="http://schemas.microsoft.com/office/word/2018/wordml" xmlns:w16sdtdh="http://schemas.microsoft.com/office/word/2020/wordml/sdtdatahash" xmlns:w16se="http://schemas.microsoft.com/office/word/2015/wordml/symex" xmlns:wpg="http://schemas.microsoft.com/office/word/2010/wordprocessingGroup" xmlns:wpi="http://schemas.microsoft.com/office/word/2010/wordprocessingInk" xmlns:wne="http://schemas.microsoft.com/office/word/2006/wordml" xmlns:wps="http://schemas.microsoft.com/office/word/2010/wordprocessingShape" mc:Ignorable="w14 w15 w16se w16cid w16 w16cex w16sdtdh wp14">
+<w:endnotes xmlns:wpc="http://schemas.microsoft.com/office/word/2010/wordprocessingCanvas" xmlns:cx="http://schemas.microsoft.com/office/drawing/2014/chartex" xmlns:cx1="http://schemas.microsoft.com/office/drawing/2015/9/8/chartex" xmlns:cx2="http://schemas.microsoft.com/office/drawing/2015/10/21/chartex" xmlns:cx3="http://schemas.microsoft.com/office/drawing/2016/5/9/chartex" xmlns:cx4="http://schemas.microsoft.com/office/drawing/2016/5/10/chartex" xmlns:cx5="http://schemas.microsoft.com/office/drawing/2016/5/11/chartex" xmlns:cx6="http://schemas.microsoft.com/office/drawing/2016/5/12/chartex" xmlns:cx7="http://schemas.microsoft.com/office/drawing/2016/5/13/chartex" xmlns:cx8="http://schemas.microsoft.com/office/drawing/2016/5/14/chartex" xmlns:mc="http://schemas.openxmlformats.org/markup-compatibility/2006" xmlns:aink="http://schemas.microsoft.com/office/drawing/2016/ink" xmlns:am3d="http://schemas.microsoft.com/office/drawing/2017/model3d" xmlns:o="urn:schemas-microsoft-com:office:office" xmlns:oel="http://schemas.microsoft.com/office/2019/extlst" xmlns:r="http://schemas.openxmlformats.org/officeDocument/2006/relationships" xmlns:m="http://schemas.openxmlformats.org/officeDocument/2006/math" xmlns:v="urn:schemas-microsoft-com:vml" xmlns:wp14="http://schemas.microsoft.com/office/word/2010/wordprocessingDrawing" xmlns:wp="http://schemas.openxmlformats.org/drawingml/2006/wordprocessingDrawing" xmlns:w10="urn:schemas-microsoft-com:office:word" xmlns:w="http://schemas.openxmlformats.org/wordprocessingml/2006/main" xmlns:w14="http://schemas.microsoft.com/office/word/2010/wordml" xmlns:w15="http://schemas.microsoft.com/office/word/2012/wordml" xmlns:w16cex="http://schemas.microsoft.com/office/word/2018/wordml/cex" xmlns:w16cid="http://schemas.microsoft.com/office/word/2016/wordml/cid" xmlns:w16="http://schemas.microsoft.com/office/word/2018/wordml" xmlns:w16du="http://schemas.microsoft.com/office/word/2023/wordml/word16du" xmlns:w16sdtdh="http://schemas.microsoft.com/office/word/2020/wordml/sdtdatahash" xmlns:w16sdtfl="http://schemas.microsoft.com/office/word/2024/wordml/sdtformatlock" xmlns:w16se="http://schemas.microsoft.com/office/word/2015/wordml/symex" xmlns:wpg="http://schemas.microsoft.com/office/word/2010/wordprocessingGroup" xmlns:wpi="http://schemas.microsoft.com/office/word/2010/wordprocessingInk" xmlns:wne="http://schemas.microsoft.com/office/word/2006/wordml" xmlns:wps="http://schemas.microsoft.com/office/word/2010/wordprocessingShape" mc:Ignorable="w14 w15 w16se w16cid w16 w16cex w16sdtdh w16sdtfl w16du wp14">
   <w:endnote w:type="separator" w:id="-1">
     <w:p>
       <w:pPr>
@@ -2110,7 +2225,7 @@
 </file>
 
 <file path=word/footer1.xml><?xml version="1.0" encoding="utf-8"?>
-<w:ftr xmlns:wpc="http://schemas.microsoft.com/office/word/2010/wordprocessingCanvas" xmlns:cx="http://schemas.microsoft.com/office/drawing/2014/chartex" xmlns:cx1="http://schemas.microsoft.com/office/drawing/2015/9/8/chartex" xmlns:cx2="http://schemas.microsoft.com/office/drawing/2015/10/21/chartex" xmlns:cx3="http://schemas.microsoft.com/office/drawing/2016/5/9/chartex" xmlns:cx4="http://schemas.microsoft.com/office/drawing/2016/5/10/chartex" xmlns:cx5="http://schemas.microsoft.com/office/drawing/2016/5/11/chartex" xmlns:cx6="http://schemas.microsoft.com/office/drawing/2016/5/12/chartex" xmlns:cx7="http://schemas.microsoft.com/office/drawing/2016/5/13/chartex" xmlns:cx8="http://schemas.microsoft.com/office/drawing/2016/5/14/chartex" xmlns:mc="http://schemas.openxmlformats.org/markup-compatibility/2006" xmlns:aink="http://schemas.microsoft.com/office/drawing/2016/ink" xmlns:am3d="http://schemas.microsoft.com/office/drawing/2017/model3d" xmlns:o="urn:schemas-microsoft-com:office:office" xmlns:oel="http://schemas.microsoft.com/office/2019/extlst" xmlns:r="http://schemas.openxmlformats.org/officeDocument/2006/relationships" xmlns:m="http://schemas.openxmlformats.org/officeDocument/2006/math" xmlns:v="urn:schemas-microsoft-com:vml" xmlns:wp14="http://schemas.microsoft.com/office/word/2010/wordprocessingDrawing" xmlns:wp="http://schemas.openxmlformats.org/drawingml/2006/wordprocessingDrawing" xmlns:w10="urn:schemas-microsoft-com:office:word" xmlns:w="http://schemas.openxmlformats.org/wordprocessingml/2006/main" xmlns:w14="http://schemas.microsoft.com/office/word/2010/wordml" xmlns:w15="http://schemas.microsoft.com/office/word/2012/wordml" xmlns:w16cex="http://schemas.microsoft.com/office/word/2018/wordml/cex" xmlns:w16cid="http://schemas.microsoft.com/office/word/2016/wordml/cid" xmlns:w16="http://schemas.microsoft.com/office/word/2018/wordml" xmlns:w16sdtdh="http://schemas.microsoft.com/office/word/2020/wordml/sdtdatahash" xmlns:w16se="http://schemas.microsoft.com/office/word/2015/wordml/symex" xmlns:wpg="http://schemas.microsoft.com/office/word/2010/wordprocessingGroup" xmlns:wpi="http://schemas.microsoft.com/office/word/2010/wordprocessingInk" xmlns:wne="http://schemas.microsoft.com/office/word/2006/wordml" xmlns:wps="http://schemas.microsoft.com/office/word/2010/wordprocessingShape" mc:Ignorable="w14 w15 w16se w16cid w16 w16cex w16sdtdh wp14">
+<w:ftr xmlns:wpc="http://schemas.microsoft.com/office/word/2010/wordprocessingCanvas" xmlns:cx="http://schemas.microsoft.com/office/drawing/2014/chartex" xmlns:cx1="http://schemas.microsoft.com/office/drawing/2015/9/8/chartex" xmlns:cx2="http://schemas.microsoft.com/office/drawing/2015/10/21/chartex" xmlns:cx3="http://schemas.microsoft.com/office/drawing/2016/5/9/chartex" xmlns:cx4="http://schemas.microsoft.com/office/drawing/2016/5/10/chartex" xmlns:cx5="http://schemas.microsoft.com/office/drawing/2016/5/11/chartex" xmlns:cx6="http://schemas.microsoft.com/office/drawing/2016/5/12/chartex" xmlns:cx7="http://schemas.microsoft.com/office/drawing/2016/5/13/chartex" xmlns:cx8="http://schemas.microsoft.com/office/drawing/2016/5/14/chartex" xmlns:mc="http://schemas.openxmlformats.org/markup-compatibility/2006" xmlns:aink="http://schemas.microsoft.com/office/drawing/2016/ink" xmlns:am3d="http://schemas.microsoft.com/office/drawing/2017/model3d" xmlns:o="urn:schemas-microsoft-com:office:office" xmlns:oel="http://schemas.microsoft.com/office/2019/extlst" xmlns:r="http://schemas.openxmlformats.org/officeDocument/2006/relationships" xmlns:m="http://schemas.openxmlformats.org/officeDocument/2006/math" xmlns:v="urn:schemas-microsoft-com:vml" xmlns:wp14="http://schemas.microsoft.com/office/word/2010/wordprocessingDrawing" xmlns:wp="http://schemas.openxmlformats.org/drawingml/2006/wordprocessingDrawing" xmlns:w10="urn:schemas-microsoft-com:office:word" xmlns:w="http://schemas.openxmlformats.org/wordprocessingml/2006/main" xmlns:w14="http://schemas.microsoft.com/office/word/2010/wordml" xmlns:w15="http://schemas.microsoft.com/office/word/2012/wordml" xmlns:w16cex="http://schemas.microsoft.com/office/word/2018/wordml/cex" xmlns:w16cid="http://schemas.microsoft.com/office/word/2016/wordml/cid" xmlns:w16="http://schemas.microsoft.com/office/word/2018/wordml" xmlns:w16du="http://schemas.microsoft.com/office/word/2023/wordml/word16du" xmlns:w16sdtdh="http://schemas.microsoft.com/office/word/2020/wordml/sdtdatahash" xmlns:w16sdtfl="http://schemas.microsoft.com/office/word/2024/wordml/sdtformatlock" xmlns:w16se="http://schemas.microsoft.com/office/word/2015/wordml/symex" xmlns:wpg="http://schemas.microsoft.com/office/word/2010/wordprocessingGroup" xmlns:wpi="http://schemas.microsoft.com/office/word/2010/wordprocessingInk" xmlns:wne="http://schemas.microsoft.com/office/word/2006/wordml" xmlns:wps="http://schemas.microsoft.com/office/word/2010/wordprocessingShape" mc:Ignorable="w14 w15 w16se w16cid w16 w16cex w16sdtdh w16sdtfl w16du wp14">
   <w:sdt>
     <w:sdtPr>
       <w:rPr>
@@ -2162,7 +2277,7 @@
 </file>
 
 <file path=word/footer2.xml><?xml version="1.0" encoding="utf-8"?>
-<w:ftr xmlns:wpc="http://schemas.microsoft.com/office/word/2010/wordprocessingCanvas" xmlns:cx="http://schemas.microsoft.com/office/drawing/2014/chartex" xmlns:cx1="http://schemas.microsoft.com/office/drawing/2015/9/8/chartex" xmlns:cx2="http://schemas.microsoft.com/office/drawing/2015/10/21/chartex" xmlns:cx3="http://schemas.microsoft.com/office/drawing/2016/5/9/chartex" xmlns:cx4="http://schemas.microsoft.com/office/drawing/2016/5/10/chartex" xmlns:cx5="http://schemas.microsoft.com/office/drawing/2016/5/11/chartex" xmlns:cx6="http://schemas.microsoft.com/office/drawing/2016/5/12/chartex" xmlns:cx7="http://schemas.microsoft.com/office/drawing/2016/5/13/chartex" xmlns:cx8="http://schemas.microsoft.com/office/drawing/2016/5/14/chartex" xmlns:mc="http://schemas.openxmlformats.org/markup-compatibility/2006" xmlns:aink="http://schemas.microsoft.com/office/drawing/2016/ink" xmlns:am3d="http://schemas.microsoft.com/office/drawing/2017/model3d" xmlns:o="urn:schemas-microsoft-com:office:office" xmlns:oel="http://schemas.microsoft.com/office/2019/extlst" xmlns:r="http://schemas.openxmlformats.org/officeDocument/2006/relationships" xmlns:m="http://schemas.openxmlformats.org/officeDocument/2006/math" xmlns:v="urn:schemas-microsoft-com:vml" xmlns:wp14="http://schemas.microsoft.com/office/word/2010/wordprocessingDrawing" xmlns:wp="http://schemas.openxmlformats.org/drawingml/2006/wordprocessingDrawing" xmlns:w10="urn:schemas-microsoft-com:office:word" xmlns:w="http://schemas.openxmlformats.org/wordprocessingml/2006/main" xmlns:w14="http://schemas.microsoft.com/office/word/2010/wordml" xmlns:w15="http://schemas.microsoft.com/office/word/2012/wordml" xmlns:w16cex="http://schemas.microsoft.com/office/word/2018/wordml/cex" xmlns:w16cid="http://schemas.microsoft.com/office/word/2016/wordml/cid" xmlns:w16="http://schemas.microsoft.com/office/word/2018/wordml" xmlns:w16sdtdh="http://schemas.microsoft.com/office/word/2020/wordml/sdtdatahash" xmlns:w16se="http://schemas.microsoft.com/office/word/2015/wordml/symex" xmlns:wpg="http://schemas.microsoft.com/office/word/2010/wordprocessingGroup" xmlns:wpi="http://schemas.microsoft.com/office/word/2010/wordprocessingInk" xmlns:wne="http://schemas.microsoft.com/office/word/2006/wordml" xmlns:wps="http://schemas.microsoft.com/office/word/2010/wordprocessingShape" mc:Ignorable="w14 w15 w16se w16cid w16 w16cex w16sdtdh wp14">
+<w:ftr xmlns:wpc="http://schemas.microsoft.com/office/word/2010/wordprocessingCanvas" xmlns:cx="http://schemas.microsoft.com/office/drawing/2014/chartex" xmlns:cx1="http://schemas.microsoft.com/office/drawing/2015/9/8/chartex" xmlns:cx2="http://schemas.microsoft.com/office/drawing/2015/10/21/chartex" xmlns:cx3="http://schemas.microsoft.com/office/drawing/2016/5/9/chartex" xmlns:cx4="http://schemas.microsoft.com/office/drawing/2016/5/10/chartex" xmlns:cx5="http://schemas.microsoft.com/office/drawing/2016/5/11/chartex" xmlns:cx6="http://schemas.microsoft.com/office/drawing/2016/5/12/chartex" xmlns:cx7="http://schemas.microsoft.com/office/drawing/2016/5/13/chartex" xmlns:cx8="http://schemas.microsoft.com/office/drawing/2016/5/14/chartex" xmlns:mc="http://schemas.openxmlformats.org/markup-compatibility/2006" xmlns:aink="http://schemas.microsoft.com/office/drawing/2016/ink" xmlns:am3d="http://schemas.microsoft.com/office/drawing/2017/model3d" xmlns:o="urn:schemas-microsoft-com:office:office" xmlns:oel="http://schemas.microsoft.com/office/2019/extlst" xmlns:r="http://schemas.openxmlformats.org/officeDocument/2006/relationships" xmlns:m="http://schemas.openxmlformats.org/officeDocument/2006/math" xmlns:v="urn:schemas-microsoft-com:vml" xmlns:wp14="http://schemas.microsoft.com/office/word/2010/wordprocessingDrawing" xmlns:wp="http://schemas.openxmlformats.org/drawingml/2006/wordprocessingDrawing" xmlns:w10="urn:schemas-microsoft-com:office:word" xmlns:w="http://schemas.openxmlformats.org/wordprocessingml/2006/main" xmlns:w14="http://schemas.microsoft.com/office/word/2010/wordml" xmlns:w15="http://schemas.microsoft.com/office/word/2012/wordml" xmlns:w16cex="http://schemas.microsoft.com/office/word/2018/wordml/cex" xmlns:w16cid="http://schemas.microsoft.com/office/word/2016/wordml/cid" xmlns:w16="http://schemas.microsoft.com/office/word/2018/wordml" xmlns:w16du="http://schemas.microsoft.com/office/word/2023/wordml/word16du" xmlns:w16sdtdh="http://schemas.microsoft.com/office/word/2020/wordml/sdtdatahash" xmlns:w16sdtfl="http://schemas.microsoft.com/office/word/2024/wordml/sdtformatlock" xmlns:w16se="http://schemas.microsoft.com/office/word/2015/wordml/symex" xmlns:wpg="http://schemas.microsoft.com/office/word/2010/wordprocessingGroup" xmlns:wpi="http://schemas.microsoft.com/office/word/2010/wordprocessingInk" xmlns:wne="http://schemas.microsoft.com/office/word/2006/wordml" xmlns:wps="http://schemas.microsoft.com/office/word/2010/wordprocessingShape" mc:Ignorable="w14 w15 w16se w16cid w16 w16cex w16sdtdh w16sdtfl w16du wp14">
   <w:sdt>
     <w:sdtPr>
       <w:rPr>
@@ -2227,7 +2342,7 @@
 </file>
 
 <file path=word/footnotes.xml><?xml version="1.0" encoding="utf-8"?>
-<w:footnotes xmlns:wpc="http://schemas.microsoft.com/office/word/2010/wordprocessingCanvas" xmlns:cx="http://schemas.microsoft.com/office/drawing/2014/chartex" xmlns:cx1="http://schemas.microsoft.com/office/drawing/2015/9/8/chartex" xmlns:cx2="http://schemas.microsoft.com/office/drawing/2015/10/21/chartex" xmlns:cx3="http://schemas.microsoft.com/office/drawing/2016/5/9/chartex" xmlns:cx4="http://schemas.microsoft.com/office/drawing/2016/5/10/chartex" xmlns:cx5="http://schemas.microsoft.com/office/drawing/2016/5/11/chartex" xmlns:cx6="http://schemas.microsoft.com/office/drawing/2016/5/12/chartex" xmlns:cx7="http://schemas.microsoft.com/office/drawing/2016/5/13/chartex" xmlns:cx8="http://schemas.microsoft.com/office/drawing/2016/5/14/chartex" xmlns:mc="http://schemas.openxmlformats.org/markup-compatibility/2006" xmlns:aink="http://schemas.microsoft.com/office/drawing/2016/ink" xmlns:am3d="http://schemas.microsoft.com/office/drawing/2017/model3d" xmlns:o="urn:schemas-microsoft-com:office:office" xmlns:oel="http://schemas.microsoft.com/office/2019/extlst" xmlns:r="http://schemas.openxmlformats.org/officeDocument/2006/relationships" xmlns:m="http://schemas.openxmlformats.org/officeDocument/2006/math" xmlns:v="urn:schemas-microsoft-com:vml" xmlns:wp14="http://schemas.microsoft.com/office/word/2010/wordprocessingDrawing" xmlns:wp="http://schemas.openxmlformats.org/drawingml/2006/wordprocessingDrawing" xmlns:w10="urn:schemas-microsoft-com:office:word" xmlns:w="http://schemas.openxmlformats.org/wordprocessingml/2006/main" xmlns:w14="http://schemas.microsoft.com/office/word/2010/wordml" xmlns:w15="http://schemas.microsoft.com/office/word/2012/wordml" xmlns:w16cex="http://schemas.microsoft.com/office/word/2018/wordml/cex" xmlns:w16cid="http://schemas.microsoft.com/office/word/2016/wordml/cid" xmlns:w16="http://schemas.microsoft.com/office/word/2018/wordml" xmlns:w16sdtdh="http://schemas.microsoft.com/office/word/2020/wordml/sdtdatahash" xmlns:w16se="http://schemas.microsoft.com/office/word/2015/wordml/symex" xmlns:wpg="http://schemas.microsoft.com/office/word/2010/wordprocessingGroup" xmlns:wpi="http://schemas.microsoft.com/office/word/2010/wordprocessingInk" xmlns:wne="http://schemas.microsoft.com/office/word/2006/wordml" xmlns:wps="http://schemas.microsoft.com/office/word/2010/wordprocessingShape" mc:Ignorable="w14 w15 w16se w16cid w16 w16cex w16sdtdh wp14">
+<w:footnotes xmlns:wpc="http://schemas.microsoft.com/office/word/2010/wordprocessingCanvas" xmlns:cx="http://schemas.microsoft.com/office/drawing/2014/chartex" xmlns:cx1="http://schemas.microsoft.com/office/drawing/2015/9/8/chartex" xmlns:cx2="http://schemas.microsoft.com/office/drawing/2015/10/21/chartex" xmlns:cx3="http://schemas.microsoft.com/office/drawing/2016/5/9/chartex" xmlns:cx4="http://schemas.microsoft.com/office/drawing/2016/5/10/chartex" xmlns:cx5="http://schemas.microsoft.com/office/drawing/2016/5/11/chartex" xmlns:cx6="http://schemas.microsoft.com/office/drawing/2016/5/12/chartex" xmlns:cx7="http://schemas.microsoft.com/office/drawing/2016/5/13/chartex" xmlns:cx8="http://schemas.microsoft.com/office/drawing/2016/5/14/chartex" xmlns:mc="http://schemas.openxmlformats.org/markup-compatibility/2006" xmlns:aink="http://schemas.microsoft.com/office/drawing/2016/ink" xmlns:am3d="http://schemas.microsoft.com/office/drawing/2017/model3d" xmlns:o="urn:schemas-microsoft-com:office:office" xmlns:oel="http://schemas.microsoft.com/office/2019/extlst" xmlns:r="http://schemas.openxmlformats.org/officeDocument/2006/relationships" xmlns:m="http://schemas.openxmlformats.org/officeDocument/2006/math" xmlns:v="urn:schemas-microsoft-com:vml" xmlns:wp14="http://schemas.microsoft.com/office/word/2010/wordprocessingDrawing" xmlns:wp="http://schemas.openxmlformats.org/drawingml/2006/wordprocessingDrawing" xmlns:w10="urn:schemas-microsoft-com:office:word" xmlns:w="http://schemas.openxmlformats.org/wordprocessingml/2006/main" xmlns:w14="http://schemas.microsoft.com/office/word/2010/wordml" xmlns:w15="http://schemas.microsoft.com/office/word/2012/wordml" xmlns:w16cex="http://schemas.microsoft.com/office/word/2018/wordml/cex" xmlns:w16cid="http://schemas.microsoft.com/office/word/2016/wordml/cid" xmlns:w16="http://schemas.microsoft.com/office/word/2018/wordml" xmlns:w16du="http://schemas.microsoft.com/office/word/2023/wordml/word16du" xmlns:w16sdtdh="http://schemas.microsoft.com/office/word/2020/wordml/sdtdatahash" xmlns:w16sdtfl="http://schemas.microsoft.com/office/word/2024/wordml/sdtformatlock" xmlns:w16se="http://schemas.microsoft.com/office/word/2015/wordml/symex" xmlns:wpg="http://schemas.microsoft.com/office/word/2010/wordprocessingGroup" xmlns:wpi="http://schemas.microsoft.com/office/word/2010/wordprocessingInk" xmlns:wne="http://schemas.microsoft.com/office/word/2006/wordml" xmlns:wps="http://schemas.microsoft.com/office/word/2010/wordprocessingShape" mc:Ignorable="w14 w15 w16se w16cid w16 w16cex w16sdtdh w16sdtfl w16du wp14">
   <w:footnote w:type="separator" w:id="-1">
     <w:p>
       <w:pPr>
@@ -2252,7 +2367,7 @@
 </file>
 
 <file path=word/header1.xml><?xml version="1.0" encoding="utf-8"?>
-<w:hdr xmlns:wpc="http://schemas.microsoft.com/office/word/2010/wordprocessingCanvas" xmlns:cx="http://schemas.microsoft.com/office/drawing/2014/chartex" xmlns:cx1="http://schemas.microsoft.com/office/drawing/2015/9/8/chartex" xmlns:cx2="http://schemas.microsoft.com/office/drawing/2015/10/21/chartex" xmlns:cx3="http://schemas.microsoft.com/office/drawing/2016/5/9/chartex" xmlns:cx4="http://schemas.microsoft.com/office/drawing/2016/5/10/chartex" xmlns:cx5="http://schemas.microsoft.com/office/drawing/2016/5/11/chartex" xmlns:cx6="http://schemas.microsoft.com/office/drawing/2016/5/12/chartex" xmlns:cx7="http://schemas.microsoft.com/office/drawing/2016/5/13/chartex" xmlns:cx8="http://schemas.microsoft.com/office/drawing/2016/5/14/chartex" xmlns:mc="http://schemas.openxmlformats.org/markup-compatibility/2006" xmlns:aink="http://schemas.microsoft.com/office/drawing/2016/ink" xmlns:am3d="http://schemas.microsoft.com/office/drawing/2017/model3d" xmlns:o="urn:schemas-microsoft-com:office:office" xmlns:oel="http://schemas.microsoft.com/office/2019/extlst" xmlns:r="http://schemas.openxmlformats.org/officeDocument/2006/relationships" xmlns:m="http://schemas.openxmlformats.org/officeDocument/2006/math" xmlns:v="urn:schemas-microsoft-com:vml" xmlns:wp14="http://schemas.microsoft.com/office/word/2010/wordprocessingDrawing" xmlns:wp="http://schemas.openxmlformats.org/drawingml/2006/wordprocessingDrawing" xmlns:w10="urn:schemas-microsoft-com:office:word" xmlns:w="http://schemas.openxmlformats.org/wordprocessingml/2006/main" xmlns:w14="http://schemas.microsoft.com/office/word/2010/wordml" xmlns:w15="http://schemas.microsoft.com/office/word/2012/wordml" xmlns:w16cex="http://schemas.microsoft.com/office/word/2018/wordml/cex" xmlns:w16cid="http://schemas.microsoft.com/office/word/2016/wordml/cid" xmlns:w16="http://schemas.microsoft.com/office/word/2018/wordml" xmlns:w16sdtdh="http://schemas.microsoft.com/office/word/2020/wordml/sdtdatahash" xmlns:w16se="http://schemas.microsoft.com/office/word/2015/wordml/symex" xmlns:wpg="http://schemas.microsoft.com/office/word/2010/wordprocessingGroup" xmlns:wpi="http://schemas.microsoft.com/office/word/2010/wordprocessingInk" xmlns:wne="http://schemas.microsoft.com/office/word/2006/wordml" xmlns:wps="http://schemas.microsoft.com/office/word/2010/wordprocessingShape" mc:Ignorable="w14 w15 w16se w16cid w16 w16cex w16sdtdh wp14">
+<w:hdr xmlns:wpc="http://schemas.microsoft.com/office/word/2010/wordprocessingCanvas" xmlns:cx="http://schemas.microsoft.com/office/drawing/2014/chartex" xmlns:cx1="http://schemas.microsoft.com/office/drawing/2015/9/8/chartex" xmlns:cx2="http://schemas.microsoft.com/office/drawing/2015/10/21/chartex" xmlns:cx3="http://schemas.microsoft.com/office/drawing/2016/5/9/chartex" xmlns:cx4="http://schemas.microsoft.com/office/drawing/2016/5/10/chartex" xmlns:cx5="http://schemas.microsoft.com/office/drawing/2016/5/11/chartex" xmlns:cx6="http://schemas.microsoft.com/office/drawing/2016/5/12/chartex" xmlns:cx7="http://schemas.microsoft.com/office/drawing/2016/5/13/chartex" xmlns:cx8="http://schemas.microsoft.com/office/drawing/2016/5/14/chartex" xmlns:mc="http://schemas.openxmlformats.org/markup-compatibility/2006" xmlns:aink="http://schemas.microsoft.com/office/drawing/2016/ink" xmlns:am3d="http://schemas.microsoft.com/office/drawing/2017/model3d" xmlns:o="urn:schemas-microsoft-com:office:office" xmlns:oel="http://schemas.microsoft.com/office/2019/extlst" xmlns:r="http://schemas.openxmlformats.org/officeDocument/2006/relationships" xmlns:m="http://schemas.openxmlformats.org/officeDocument/2006/math" xmlns:v="urn:schemas-microsoft-com:vml" xmlns:wp14="http://schemas.microsoft.com/office/word/2010/wordprocessingDrawing" xmlns:wp="http://schemas.openxmlformats.org/drawingml/2006/wordprocessingDrawing" xmlns:w10="urn:schemas-microsoft-com:office:word" xmlns:w="http://schemas.openxmlformats.org/wordprocessingml/2006/main" xmlns:w14="http://schemas.microsoft.com/office/word/2010/wordml" xmlns:w15="http://schemas.microsoft.com/office/word/2012/wordml" xmlns:w16cex="http://schemas.microsoft.com/office/word/2018/wordml/cex" xmlns:w16cid="http://schemas.microsoft.com/office/word/2016/wordml/cid" xmlns:w16="http://schemas.microsoft.com/office/word/2018/wordml" xmlns:w16du="http://schemas.microsoft.com/office/word/2023/wordml/word16du" xmlns:w16sdtdh="http://schemas.microsoft.com/office/word/2020/wordml/sdtdatahash" xmlns:w16sdtfl="http://schemas.microsoft.com/office/word/2024/wordml/sdtformatlock" xmlns:w16se="http://schemas.microsoft.com/office/word/2015/wordml/symex" xmlns:wpg="http://schemas.microsoft.com/office/word/2010/wordprocessingGroup" xmlns:wpi="http://schemas.microsoft.com/office/word/2010/wordprocessingInk" xmlns:wne="http://schemas.microsoft.com/office/word/2006/wordml" xmlns:wps="http://schemas.microsoft.com/office/word/2010/wordprocessingShape" mc:Ignorable="w14 w15 w16se w16cid w16 w16cex w16sdtdh w16sdtfl w16du wp14">
   <w:p>
     <w:pPr>
       <w:pStyle w:val="Header"/>
@@ -2269,7 +2384,7 @@
 </file>
 
 <file path=word/numbering.xml><?xml version="1.0" encoding="utf-8"?>
-<w:numbering xmlns:wpc="http://schemas.microsoft.com/office/word/2010/wordprocessingCanvas" xmlns:cx="http://schemas.microsoft.com/office/drawing/2014/chartex" xmlns:cx1="http://schemas.microsoft.com/office/drawing/2015/9/8/chartex" xmlns:cx2="http://schemas.microsoft.com/office/drawing/2015/10/21/chartex" xmlns:cx3="http://schemas.microsoft.com/office/drawing/2016/5/9/chartex" xmlns:cx4="http://schemas.microsoft.com/office/drawing/2016/5/10/chartex" xmlns:cx5="http://schemas.microsoft.com/office/drawing/2016/5/11/chartex" xmlns:cx6="http://schemas.microsoft.com/office/drawing/2016/5/12/chartex" xmlns:cx7="http://schemas.microsoft.com/office/drawing/2016/5/13/chartex" xmlns:cx8="http://schemas.microsoft.com/office/drawing/2016/5/14/chartex" xmlns:mc="http://schemas.openxmlformats.org/markup-compatibility/2006" xmlns:aink="http://schemas.microsoft.com/office/drawing/2016/ink" xmlns:am3d="http://schemas.microsoft.com/office/drawing/2017/model3d" xmlns:o="urn:schemas-microsoft-com:office:office" xmlns:oel="http://schemas.microsoft.com/office/2019/extlst" xmlns:r="http://schemas.openxmlformats.org/officeDocument/2006/relationships" xmlns:m="http://schemas.openxmlformats.org/officeDocument/2006/math" xmlns:v="urn:schemas-microsoft-com:vml" xmlns:wp14="http://schemas.microsoft.com/office/word/2010/wordprocessingDrawing" xmlns:wp="http://schemas.openxmlformats.org/drawingml/2006/wordprocessingDrawing" xmlns:w10="urn:schemas-microsoft-com:office:word" xmlns:w="http://schemas.openxmlformats.org/wordprocessingml/2006/main" xmlns:w14="http://schemas.microsoft.com/office/word/2010/wordml" xmlns:w15="http://schemas.microsoft.com/office/word/2012/wordml" xmlns:w16cex="http://schemas.microsoft.com/office/word/2018/wordml/cex" xmlns:w16cid="http://schemas.microsoft.com/office/word/2016/wordml/cid" xmlns:w16="http://schemas.microsoft.com/office/word/2018/wordml" xmlns:w16sdtdh="http://schemas.microsoft.com/office/word/2020/wordml/sdtdatahash" xmlns:w16se="http://schemas.microsoft.com/office/word/2015/wordml/symex" xmlns:wpg="http://schemas.microsoft.com/office/word/2010/wordprocessingGroup" xmlns:wpi="http://schemas.microsoft.com/office/word/2010/wordprocessingInk" xmlns:wne="http://schemas.microsoft.com/office/word/2006/wordml" xmlns:wps="http://schemas.microsoft.com/office/word/2010/wordprocessingShape" mc:Ignorable="w14 w15 w16se w16cid w16 w16cex w16sdtdh wp14">
+<w:numbering xmlns:wpc="http://schemas.microsoft.com/office/word/2010/wordprocessingCanvas" xmlns:cx="http://schemas.microsoft.com/office/drawing/2014/chartex" xmlns:cx1="http://schemas.microsoft.com/office/drawing/2015/9/8/chartex" xmlns:cx2="http://schemas.microsoft.com/office/drawing/2015/10/21/chartex" xmlns:cx3="http://schemas.microsoft.com/office/drawing/2016/5/9/chartex" xmlns:cx4="http://schemas.microsoft.com/office/drawing/2016/5/10/chartex" xmlns:cx5="http://schemas.microsoft.com/office/drawing/2016/5/11/chartex" xmlns:cx6="http://schemas.microsoft.com/office/drawing/2016/5/12/chartex" xmlns:cx7="http://schemas.microsoft.com/office/drawing/2016/5/13/chartex" xmlns:cx8="http://schemas.microsoft.com/office/drawing/2016/5/14/chartex" xmlns:mc="http://schemas.openxmlformats.org/markup-compatibility/2006" xmlns:aink="http://schemas.microsoft.com/office/drawing/2016/ink" xmlns:am3d="http://schemas.microsoft.com/office/drawing/2017/model3d" xmlns:o="urn:schemas-microsoft-com:office:office" xmlns:oel="http://schemas.microsoft.com/office/2019/extlst" xmlns:r="http://schemas.openxmlformats.org/officeDocument/2006/relationships" xmlns:m="http://schemas.openxmlformats.org/officeDocument/2006/math" xmlns:v="urn:schemas-microsoft-com:vml" xmlns:wp14="http://schemas.microsoft.com/office/word/2010/wordprocessingDrawing" xmlns:wp="http://schemas.openxmlformats.org/drawingml/2006/wordprocessingDrawing" xmlns:w10="urn:schemas-microsoft-com:office:word" xmlns:w="http://schemas.openxmlformats.org/wordprocessingml/2006/main" xmlns:w14="http://schemas.microsoft.com/office/word/2010/wordml" xmlns:w15="http://schemas.microsoft.com/office/word/2012/wordml" xmlns:w16cex="http://schemas.microsoft.com/office/word/2018/wordml/cex" xmlns:w16cid="http://schemas.microsoft.com/office/word/2016/wordml/cid" xmlns:w16="http://schemas.microsoft.com/office/word/2018/wordml" xmlns:w16du="http://schemas.microsoft.com/office/word/2023/wordml/word16du" xmlns:w16sdtdh="http://schemas.microsoft.com/office/word/2020/wordml/sdtdatahash" xmlns:w16sdtfl="http://schemas.microsoft.com/office/word/2024/wordml/sdtformatlock" xmlns:w16se="http://schemas.microsoft.com/office/word/2015/wordml/symex" xmlns:wpg="http://schemas.microsoft.com/office/word/2010/wordprocessingGroup" xmlns:wpi="http://schemas.microsoft.com/office/word/2010/wordprocessingInk" xmlns:wne="http://schemas.microsoft.com/office/word/2006/wordml" xmlns:wps="http://schemas.microsoft.com/office/word/2010/wordprocessingShape" mc:Ignorable="w14 w15 w16se w16cid w16 w16cex w16sdtdh w16sdtfl w16du wp14">
   <w:abstractNum w:abstractNumId="0" w15:restartNumberingAfterBreak="0">
     <w:nsid w:val="05746CA7"/>
     <w:multiLevelType w:val="hybridMultilevel"/>
@@ -2372,7 +2487,7 @@
         <w:rFonts w:ascii="Symbol" w:hAnsi="Symbol" w:hint="default"/>
       </w:rPr>
     </w:lvl>
-    <w:lvl w:ilvl="1" w:tplc="04090003" w:tentative="1">
+    <w:lvl w:ilvl="1" w:tplc="04090003">
       <w:start w:val="1"/>
       <w:numFmt w:val="bullet"/>
       <w:lvlText w:val="o"/>
@@ -2889,7 +3004,7 @@
 </file>
 
 <file path=word/styles.xml><?xml version="1.0" encoding="utf-8"?>
-<w:styles xmlns:mc="http://schemas.openxmlformats.org/markup-compatibility/2006" xmlns:r="http://schemas.openxmlformats.org/officeDocument/2006/relationships" xmlns:w="http://schemas.openxmlformats.org/wordprocessingml/2006/main" xmlns:w14="http://schemas.microsoft.com/office/word/2010/wordml" xmlns:w15="http://schemas.microsoft.com/office/word/2012/wordml" xmlns:w16cex="http://schemas.microsoft.com/office/word/2018/wordml/cex" xmlns:w16cid="http://schemas.microsoft.com/office/word/2016/wordml/cid" xmlns:w16="http://schemas.microsoft.com/office/word/2018/wordml" xmlns:w16sdtdh="http://schemas.microsoft.com/office/word/2020/wordml/sdtdatahash" xmlns:w16se="http://schemas.microsoft.com/office/word/2015/wordml/symex" mc:Ignorable="w14 w15 w16se w16cid w16 w16cex w16sdtdh">
+<w:styles xmlns:mc="http://schemas.openxmlformats.org/markup-compatibility/2006" xmlns:r="http://schemas.openxmlformats.org/officeDocument/2006/relationships" xmlns:w="http://schemas.openxmlformats.org/wordprocessingml/2006/main" xmlns:w14="http://schemas.microsoft.com/office/word/2010/wordml" xmlns:w15="http://schemas.microsoft.com/office/word/2012/wordml" xmlns:w16cex="http://schemas.microsoft.com/office/word/2018/wordml/cex" xmlns:w16cid="http://schemas.microsoft.com/office/word/2016/wordml/cid" xmlns:w16="http://schemas.microsoft.com/office/word/2018/wordml" xmlns:w16du="http://schemas.microsoft.com/office/word/2023/wordml/word16du" xmlns:w16sdtdh="http://schemas.microsoft.com/office/word/2020/wordml/sdtdatahash" xmlns:w16sdtfl="http://schemas.microsoft.com/office/word/2024/wordml/sdtformatlock" xmlns:w16se="http://schemas.microsoft.com/office/word/2015/wordml/symex" mc:Ignorable="w14 w15 w16se w16cid w16 w16cex w16sdtdh w16sdtfl w16du">
   <w:docDefaults>
     <w:rPrDefault>
       <w:rPr>
@@ -3621,6 +3736,25 @@
     <w:unhideWhenUsed/>
     <w:rsid w:val="00C304A7"/>
   </w:style>
+  <w:style w:type="table" w:styleId="TableGrid">
+    <w:name w:val="Table Grid"/>
+    <w:basedOn w:val="TableNormal"/>
+    <w:uiPriority w:val="39"/>
+    <w:rsid w:val="00BA50BE"/>
+    <w:pPr>
+      <w:spacing w:line="240" w:lineRule="auto"/>
+    </w:pPr>
+    <w:tblPr>
+      <w:tblBorders>
+        <w:top w:val="single" w:sz="4" w:space="0" w:color="auto"/>
+        <w:left w:val="single" w:sz="4" w:space="0" w:color="auto"/>
+        <w:bottom w:val="single" w:sz="4" w:space="0" w:color="auto"/>
+        <w:right w:val="single" w:sz="4" w:space="0" w:color="auto"/>
+        <w:insideH w:val="single" w:sz="4" w:space="0" w:color="auto"/>
+        <w:insideV w:val="single" w:sz="4" w:space="0" w:color="auto"/>
+      </w:tblBorders>
+    </w:tblPr>
+  </w:style>
 </w:styles>
 </file>
 

</xml_diff>

<commit_message>
Updated Attack Surface Analysis Report and Attack Surface Analysis - Triage Procedure (issues should go into the threat prioritization process)
</commit_message>
<xml_diff>
--- a/source/reference_documents/secondary_documents/design phase/Attack Surface Analysis Report/Attack Surface Analysis Report.docx
+++ b/source/reference_documents/secondary_documents/design phase/Attack Surface Analysis Report/Attack Surface Analysis Report.docx
@@ -28,7 +28,7 @@
         <w:t xml:space="preserve">Version </w:t>
       </w:r>
       <w:r>
-        <w:t>7</w:t>
+        <w:t>8</w:t>
       </w:r>
     </w:p>
     <w:p>
@@ -45,7 +45,7 @@
         <w:rPr>
           <w:noProof/>
         </w:rPr>
-        <w:t>3/31/26 1:53 PM</w:t>
+        <w:t>7/2/26 9:33 AM</w:t>
       </w:r>
       <w:r>
         <w:fldChar w:fldCharType="end"/>
@@ -527,8 +527,8 @@
           <w:szCs w:val="22"/>
         </w:rPr>
         <w:drawing>
-          <wp:inline distT="0" distB="0" distL="0" distR="0" wp14:anchorId="0FBE55F7" wp14:editId="4323D7A8">
-            <wp:extent cx="5943600" cy="2761599"/>
+          <wp:inline distT="0" distB="0" distL="0" distR="0" wp14:anchorId="0FBE55F7" wp14:editId="4736CAD0">
+            <wp:extent cx="5943600" cy="2644926"/>
             <wp:effectExtent l="0" t="0" r="0" b="0"/>
             <wp:docPr id="1" name="Picture 1"/>
             <wp:cNvGraphicFramePr>
@@ -542,13 +542,7 @@
                     <pic:cNvPicPr/>
                   </pic:nvPicPr>
                   <pic:blipFill>
-                    <a:blip r:embed="rId8" cstate="print">
-                      <a:extLst>
-                        <a:ext uri="{28A0092B-C50C-407E-A947-70E740481C1C}">
-                          <a14:useLocalDpi xmlns:a14="http://schemas.microsoft.com/office/drawing/2010/main" val="0"/>
-                        </a:ext>
-                      </a:extLst>
-                    </a:blip>
+                    <a:blip r:embed="rId8"/>
                     <a:stretch>
                       <a:fillRect/>
                     </a:stretch>
@@ -556,7 +550,7 @@
                   <pic:spPr>
                     <a:xfrm>
                       <a:off x="0" y="0"/>
-                      <a:ext cx="5943600" cy="2761599"/>
+                      <a:ext cx="5943600" cy="2644926"/>
                     </a:xfrm>
                     <a:prstGeom prst="rect">
                       <a:avLst/>
@@ -840,8 +834,8 @@
           <w:noProof/>
         </w:rPr>
         <w:drawing>
-          <wp:inline distT="0" distB="0" distL="0" distR="0" wp14:anchorId="373E3000" wp14:editId="2DE84821">
-            <wp:extent cx="3507087" cy="4424505"/>
+          <wp:inline distT="0" distB="0" distL="0" distR="0" wp14:anchorId="373E3000" wp14:editId="1417720D">
+            <wp:extent cx="3506211" cy="4424505"/>
             <wp:effectExtent l="0" t="0" r="0" b="0"/>
             <wp:docPr id="2" name="Picture 2"/>
             <wp:cNvGraphicFramePr>
@@ -855,13 +849,7 @@
                     <pic:cNvPicPr/>
                   </pic:nvPicPr>
                   <pic:blipFill>
-                    <a:blip r:embed="rId9" cstate="print">
-                      <a:extLst>
-                        <a:ext uri="{28A0092B-C50C-407E-A947-70E740481C1C}">
-                          <a14:useLocalDpi xmlns:a14="http://schemas.microsoft.com/office/drawing/2010/main" val="0"/>
-                        </a:ext>
-                      </a:extLst>
-                    </a:blip>
+                    <a:blip r:embed="rId9"/>
                     <a:stretch>
                       <a:fillRect/>
                     </a:stretch>
@@ -869,7 +857,7 @@
                   <pic:spPr>
                     <a:xfrm>
                       <a:off x="0" y="0"/>
-                      <a:ext cx="3507087" cy="4424505"/>
+                      <a:ext cx="3506211" cy="4424505"/>
                     </a:xfrm>
                     <a:prstGeom prst="rect">
                       <a:avLst/>
@@ -1135,9 +1123,9 @@
           <w:noProof/>
         </w:rPr>
         <w:drawing>
-          <wp:inline distT="0" distB="0" distL="0" distR="0" wp14:anchorId="131C6327" wp14:editId="3A822593">
-            <wp:extent cx="3329981" cy="4405287"/>
-            <wp:effectExtent l="0" t="0" r="0" b="1905"/>
+          <wp:inline distT="0" distB="0" distL="0" distR="0" wp14:anchorId="131C6327" wp14:editId="6209B9D8">
+            <wp:extent cx="3329981" cy="4401221"/>
+            <wp:effectExtent l="0" t="0" r="0" b="5715"/>
             <wp:docPr id="3" name="Picture 3"/>
             <wp:cNvGraphicFramePr>
               <a:graphicFrameLocks xmlns:a="http://schemas.openxmlformats.org/drawingml/2006/main" noChangeAspect="1"/>
@@ -1150,13 +1138,7 @@
                     <pic:cNvPicPr/>
                   </pic:nvPicPr>
                   <pic:blipFill>
-                    <a:blip r:embed="rId10" cstate="print">
-                      <a:extLst>
-                        <a:ext uri="{28A0092B-C50C-407E-A947-70E740481C1C}">
-                          <a14:useLocalDpi xmlns:a14="http://schemas.microsoft.com/office/drawing/2010/main" val="0"/>
-                        </a:ext>
-                      </a:extLst>
-                    </a:blip>
+                    <a:blip r:embed="rId10"/>
                     <a:stretch>
                       <a:fillRect/>
                     </a:stretch>
@@ -1164,7 +1146,7 @@
                   <pic:spPr>
                     <a:xfrm>
                       <a:off x="0" y="0"/>
-                      <a:ext cx="3329981" cy="4405287"/>
+                      <a:ext cx="3329981" cy="4401221"/>
                     </a:xfrm>
                     <a:prstGeom prst="rect">
                       <a:avLst/>
@@ -1431,8 +1413,8 @@
           <w:noProof/>
         </w:rPr>
         <w:drawing>
-          <wp:inline distT="0" distB="0" distL="0" distR="0" wp14:anchorId="0937197B" wp14:editId="4F9C4EA6">
-            <wp:extent cx="4329733" cy="4399008"/>
+          <wp:inline distT="0" distB="0" distL="0" distR="0" wp14:anchorId="0937197B" wp14:editId="36300BE2">
+            <wp:extent cx="4420541" cy="4095955"/>
             <wp:effectExtent l="0" t="0" r="0" b="0"/>
             <wp:docPr id="6" name="Picture 6"/>
             <wp:cNvGraphicFramePr>
@@ -1446,13 +1428,7 @@
                     <pic:cNvPicPr/>
                   </pic:nvPicPr>
                   <pic:blipFill>
-                    <a:blip r:embed="rId11" cstate="print">
-                      <a:extLst>
-                        <a:ext uri="{28A0092B-C50C-407E-A947-70E740481C1C}">
-                          <a14:useLocalDpi xmlns:a14="http://schemas.microsoft.com/office/drawing/2010/main" val="0"/>
-                        </a:ext>
-                      </a:extLst>
-                    </a:blip>
+                    <a:blip r:embed="rId11"/>
                     <a:stretch>
                       <a:fillRect/>
                     </a:stretch>
@@ -1460,7 +1436,7 @@
                   <pic:spPr>
                     <a:xfrm>
                       <a:off x="0" y="0"/>
-                      <a:ext cx="4329733" cy="4399008"/>
+                      <a:ext cx="4420541" cy="4095955"/>
                     </a:xfrm>
                     <a:prstGeom prst="rect">
                       <a:avLst/>
@@ -1541,6 +1517,7 @@
     </w:p>
     <w:p>
       <w:pPr>
+        <w:spacing w:after="240"/>
         <w:jc w:val="both"/>
       </w:pPr>
       <w:r>
@@ -1581,14 +1558,54 @@
         <w:t>.</w:t>
       </w:r>
       <w:r>
-        <w:t xml:space="preserve"> The candidates are passed along per the </w:t>
+        <w:t xml:space="preserve"> The candidates are passed along </w:t>
+      </w:r>
+      <w:r>
+        <w:t>to</w:t>
+      </w:r>
+      <w:r>
+        <w:t xml:space="preserve"> the </w:t>
       </w:r>
       <w:r>
         <w:rPr>
           <w:b/>
           <w:bCs/>
         </w:rPr>
-        <w:t>Threat Prioritization Plan</w:t>
+        <w:t xml:space="preserve">Threat Prioritization </w:t>
+      </w:r>
+      <w:r>
+        <w:rPr>
+          <w:b/>
+          <w:bCs/>
+        </w:rPr>
+        <w:t>Process</w:t>
+      </w:r>
+      <w:r>
+        <w:t>.</w:t>
+      </w:r>
+    </w:p>
+    <w:p>
+      <w:pPr>
+        <w:spacing w:after="240"/>
+        <w:ind w:left="720" w:hanging="720"/>
+        <w:jc w:val="both"/>
+        <w:rPr>
+          <w:color w:val="000000" w:themeColor="text1"/>
+        </w:rPr>
+      </w:pPr>
+      <w:r>
+        <w:rPr>
+          <w:b/>
+          <w:bCs/>
+          <w:color w:val="0070C0"/>
+        </w:rPr>
+        <w:t>Note:</w:t>
+      </w:r>
+      <w:r>
+        <w:tab/>
+      </w:r>
+      <w:r>
+        <w:t>Depending on the element scope and nature of the identified issue, threat candidates may be entered into the issue tracking system directly</w:t>
       </w:r>
       <w:r>
         <w:t>.</w:t>
@@ -1724,13 +1741,7 @@
         <w:jc w:val="both"/>
       </w:pPr>
       <w:r>
-        <w:t>The report should be organized into summary and details sections. The summary</w:t>
-      </w:r>
-      <w:r>
-        <w:t xml:space="preserve"> i</w:t>
-      </w:r>
-      <w:r>
-        <w:t>ncludes:</w:t>
+        <w:t>The report should be organized into summary and details sections. The summary includes:</w:t>
       </w:r>
     </w:p>
     <w:p>
@@ -1745,10 +1756,7 @@
         <w:jc w:val="both"/>
       </w:pPr>
       <w:r>
-        <w:t xml:space="preserve">Description of the </w:t>
-      </w:r>
-      <w:r>
-        <w:t>element</w:t>
+        <w:t>Description of the element</w:t>
       </w:r>
     </w:p>
     <w:p>
@@ -1778,22 +1786,13 @@
         <w:jc w:val="both"/>
       </w:pPr>
       <w:r>
-        <w:t xml:space="preserve">Image of the </w:t>
-      </w:r>
-      <w:r>
-        <w:t>element</w:t>
-      </w:r>
-      <w:r>
-        <w:t xml:space="preserve"> (</w:t>
+        <w:t>Image of the element (</w:t>
       </w:r>
       <w:r>
         <w:t xml:space="preserve">photograph, </w:t>
       </w:r>
       <w:r>
-        <w:t>diagram</w:t>
-      </w:r>
-      <w:r>
-        <w:t>)</w:t>
+        <w:t>diagram)</w:t>
       </w:r>
     </w:p>
     <w:p>
@@ -1801,13 +1800,7 @@
         <w:spacing w:after="240"/>
       </w:pPr>
       <w:r>
-        <w:t xml:space="preserve">Individual </w:t>
-      </w:r>
-      <w:r>
-        <w:t>entities</w:t>
-      </w:r>
-      <w:r>
-        <w:t xml:space="preserve"> </w:t>
+        <w:t xml:space="preserve">Individual entities </w:t>
       </w:r>
       <w:r>
         <w:t>should include</w:t>

</xml_diff>